<commit_message>
proposal: correct CARES Consulting location to Saint Paul
CARES Consulting is in Saint Paul, Minnesota, not Minneapolis.
Fixed in: Frank's proposal page footer, the archived full proposal,
and the Bookkeeping Services Agreement (party address block + footer).
Agreement PDF regenerated. Minuteman's own Minneapolis address is
untouched.

Co-Authored-By: Claude Opus 4.7 (1M context) <noreply@anthropic.com>
</commit_message>
<xml_diff>
--- a/proposal-archive/Bookkeeping_Services_Agreement_Minuteman.docx
+++ b/proposal-archive/Bookkeeping_Services_Agreement_Minuteman.docx
@@ -175,7 +175,7 @@
           <w:sz w:val="22"/>
           <w:szCs w:val="22"/>
         </w:rPr>
-        <w:t xml:space="preserve">Minneapolis, Minnesota</w:t>
+        <w:t xml:space="preserve">Saint Paul, Minnesota</w:t>
       </w:r>
     </w:p>
     <w:p>
@@ -3835,7 +3835,7 @@
           <w:sz w:val="18"/>
           <w:szCs w:val="18"/>
         </w:rPr>
-        <w:t xml:space="preserve">CARES Consulting, Inc.  •  Minneapolis, Minnesota  •  caresmn.com</w:t>
+        <w:t xml:space="preserve">CARES Consulting, Inc.  •  Saint Paul, Minnesota  •  caresmn.com</w:t>
       </w:r>
     </w:p>
     <w:sectPr>

</xml_diff>

<commit_message>
bookkeeping agreement: elect Tier 2 ($5,000/month) in Section 7
Section 7 (Selected Tier) now has Tier 2 — Bookkeeping Plus — $5,000
per month checked (X), bolded, and explicitly marked SELECTED. Tier 1
left unchecked. The agreement is now a Tier 2 engagement on its face.

Effective date June 1, 2026 (set earlier). Master docx + published PDF
both updated.

Kari signs + leaves on Frank's desk; first invoice goes out by the 25th.

Co-Authored-By: Claude Opus 4.7 (1M context) <noreply@anthropic.com>
</commit_message>
<xml_diff>
--- a/proposal-archive/Bookkeeping_Services_Agreement_Minuteman.docx
+++ b/proposal-archive/Bookkeeping_Services_Agreement_Minuteman.docx
@@ -2554,11 +2554,13 @@
       <w:r>
         <w:rPr>
           <w:rFonts w:ascii="Arial" w:cs="Arial" w:eastAsia="Arial" w:hAnsi="Arial"/>
-          <w:color w:val="1A1A1A"/>
-          <w:sz w:val="22"/>
-          <w:szCs w:val="22"/>
-        </w:rPr>
-        <w:t xml:space="preserve">☐  Tier 2 — Bookkeeping Plus — $5,000 per month</w:t>
+          <w:b/>
+          <w:bCs/>
+          <w:color w:val="1A1A1A"/>
+          <w:sz w:val="22"/>
+          <w:szCs w:val="22"/>
+        </w:rPr>
+        <w:t xml:space="preserve">☒  Tier 2 — Bookkeeping Plus — $5,000 per month  —  SELECTED</w:t>
       </w:r>
     </w:p>
     <w:p>

</xml_diff>